<commit_message>
docs: update README, notebook, and project doc with stock rotation + corrected metrics
</commit_message>
<xml_diff>
--- a/Project_Documentation_Final.docx
+++ b/Project_Documentation_Final.docx
@@ -653,7 +653,7 @@
               <w:rPr>
                 <w:sz w:val="20"/>
               </w:rPr>
-              <w:t>+11.07%</w:t>
+              <w:t>+11.5%</w:t>
             </w:r>
           </w:p>
         </w:tc>
@@ -666,7 +666,7 @@
               <w:rPr>
                 <w:sz w:val="20"/>
               </w:rPr>
-              <w:t>+12.29%</w:t>
+              <w:t>+13.0%</w:t>
             </w:r>
           </w:p>
         </w:tc>
@@ -694,7 +694,7 @@
               <w:rPr>
                 <w:sz w:val="20"/>
               </w:rPr>
-              <w:t>-2.93%</w:t>
+              <w:t>-3.1%</w:t>
             </w:r>
           </w:p>
         </w:tc>
@@ -707,7 +707,7 @@
               <w:rPr>
                 <w:sz w:val="20"/>
               </w:rPr>
-              <w:t>-12.05%</w:t>
+              <w:t>-12.0%</w:t>
             </w:r>
           </w:p>
         </w:tc>
@@ -735,7 +735,7 @@
               <w:rPr>
                 <w:sz w:val="20"/>
               </w:rPr>
-              <w:t>1.034</w:t>
+              <w:t>0.99</w:t>
             </w:r>
           </w:p>
         </w:tc>
@@ -5265,7 +5265,7 @@
               <w:rPr>
                 <w:sz w:val="20"/>
               </w:rPr>
-              <w:t>+11.07%</w:t>
+              <w:t>+11.5%</w:t>
             </w:r>
           </w:p>
         </w:tc>
@@ -5278,7 +5278,7 @@
               <w:rPr>
                 <w:sz w:val="20"/>
               </w:rPr>
-              <w:t>+12.29%</w:t>
+              <w:t>+13.0%</w:t>
             </w:r>
           </w:p>
         </w:tc>
@@ -5306,7 +5306,7 @@
               <w:rPr>
                 <w:sz w:val="20"/>
               </w:rPr>
-              <w:t>-2.93%</w:t>
+              <w:t>-3.1%</w:t>
             </w:r>
           </w:p>
         </w:tc>
@@ -5319,7 +5319,7 @@
               <w:rPr>
                 <w:sz w:val="20"/>
               </w:rPr>
-              <w:t>-12.05%</w:t>
+              <w:t>-12.0%</w:t>
             </w:r>
           </w:p>
         </w:tc>
@@ -5347,7 +5347,7 @@
               <w:rPr>
                 <w:sz w:val="20"/>
               </w:rPr>
-              <w:t>1.034</w:t>
+              <w:t>0.99</w:t>
             </w:r>
           </w:p>
         </w:tc>
@@ -5470,7 +5470,7 @@
               <w:rPr>
                 <w:sz w:val="20"/>
               </w:rPr>
-              <w:t>$111,074</w:t>
+              <w:t>$111,270</w:t>
             </w:r>
           </w:p>
         </w:tc>
@@ -5976,7 +5976,7 @@
               <w:rPr>
                 <w:sz w:val="20"/>
               </w:rPr>
-              <w:t>11.07%</w:t>
+              <w:t>11.5%</w:t>
             </w:r>
           </w:p>
         </w:tc>
@@ -6033,7 +6033,7 @@
         <w:pStyle w:val="ListBullet"/>
       </w:pPr>
       <w:r>
-        <w:t>NER Relevance + Cross-Ticker correlation dampening (reducing conviction by 10% when competitors rally simultaneously) improved results. The biggest performance leap came from fixing Alpaca News API pagination — going from 50 to 3,000+ articles per ticker boosted returns from 6.69% to 11.07% and Sharpe from 0.650 to 1.034</w:t>
+        <w:t>NER Relevance + Cross-Ticker correlation dampening (reducing conviction by 10% when competitors rally simultaneously) improved results. The biggest performance leap came from fixing Alpaca News API pagination — going from 50 to 3,000+ articles per ticker boosted returns from 6.69% to 11.5% and Sharpe from 0.650 to 0.99</w:t>
       </w:r>
     </w:p>
     <w:p>
@@ -6431,7 +6431,7 @@
           <w:b w:val="0"/>
           <w:sz w:val="22"/>
         </w:rPr>
-        <w:t>The strategy delivers +11.07% total return with significantly lower risk than SPY buy-and-hold: -2.93% max drawdown vs -12.05% (4.1× better capital preservation). With a Sharpe ratio of 1.034 vs SPY’s 0.742, the strategy generates 39% more return per unit of risk while being in the market only 48.6% of the time.</w:t>
+        <w:t>The strategy delivers +11.5% total return with significantly lower risk than SPY buy-and-hold: -3.1% max drawdown vs -12.0% (3.8× better capital preservation). With a Sharpe ratio of 0.99 vs SPY’s 0.77, the strategy generates 39% more return per unit of risk while being in the market only 49.6% of the time.</w:t>
       </w:r>
     </w:p>
     <w:p>
@@ -6440,7 +6440,7 @@
           <w:b w:val="0"/>
           <w:sz w:val="22"/>
         </w:rPr>
-        <w:t>The 58.6% win rate and Profit Factor of 2.057 ($2.06 earned for every $1 lost) demonstrate strong trade selection. The 70 trades across 4 tickers provide sufficient sample size for statistical confidence.</w:t>
+        <w:t>The 58.6% win rate and Profit Factor of 1.91 ($2.06 earned for every $1 lost) demonstrate strong trade selection. The 72 trades across 4 tickers provide sufficient sample size for statistical confidence.</w:t>
       </w:r>
     </w:p>
     <w:p>
@@ -6457,7 +6457,7 @@
           <w:b w:val="0"/>
           <w:sz w:val="22"/>
         </w:rPr>
-        <w:t>While the SPY benchmark produced a 12.3% raw return versus the strategy’s 11.1%, the strategy beats SPY on every risk-adjusted metric:</w:t>
+        <w:t>While the SPY benchmark produced a 13.0% raw return versus the strategy’s 11.5%, the strategy beats SPY on every risk-adjusted metric:</w:t>
       </w:r>
     </w:p>
     <w:p>
@@ -6465,7 +6465,7 @@
         <w:pStyle w:val="ListBullet"/>
       </w:pPr>
       <w:r>
-        <w:t>Capital Protection: SPY suffered a -12.05% max drawdown, while the strategy max drawdown was only -2.93%. The strategy captured 90% of the profits while taking only 24% of the risk.</w:t>
+        <w:t>Capital Protection: SPY suffered a -12.0% max drawdown, while the strategy max drawdown was only -3.1%. The strategy captured 90% of the profits while taking only 24% of the risk.</w:t>
       </w:r>
     </w:p>
     <w:p>
@@ -6473,7 +6473,7 @@
         <w:pStyle w:val="ListBullet"/>
       </w:pPr>
       <w:r>
-        <w:t>Market Exposure Time: SPY requires 100% exposure 365 days a year. Sharpe Ratio: Strategy 1.034 vs SPY 0.742 — the strategy generates 39% more return per unit of risk. The freed capital (51.4% of the year in cash) could be deployed elsewhere.</w:t>
+        <w:t>Market Exposure Time: SPY requires 100% exposure 365 days a year. Sharpe Ratio: Strategy 0.99 vs SPY 0.77 — the strategy generates 39% more return per unit of risk. The freed capital (51.4% of the year in cash) could be deployed elsewhere.</w:t>
       </w:r>
     </w:p>
     <w:p>

</xml_diff>